<commit_message>
Added Crim + Civil Template
</commit_message>
<xml_diff>
--- a/templates/Criminal_report_format.docx
+++ b/templates/Criminal_report_format.docx
@@ -175,14 +175,7 @@
               <w:rPr>
                 <w:sz w:val="20"/>
               </w:rPr>
-              <w:t xml:space="preserve">UP TO 7 </w:t>
-            </w:r>
-            <w:r>
-              <w:rPr>
-                <w:spacing w:val="-2"/>
-                <w:sz w:val="20"/>
-              </w:rPr>
-              <w:t>YEARS</w:t>
+              <w:t>&lt;Scope&gt;</w:t>
             </w:r>
           </w:p>
         </w:tc>
@@ -215,7 +208,6 @@
         </w:rPr>
         <w:t>access to proprietary databases, as well as international criminal watchlists, sanctions lists, and politically exposed persons</w:t>
       </w:r>
-      <w:proofErr w:type="gramStart"/>
       <w:r>
         <w:rPr>
           <w:sz w:val="20"/>
@@ -226,14 +218,7 @@
         <w:rPr>
           <w:sz w:val="20"/>
         </w:rPr>
-        <w:t>(</w:t>
-      </w:r>
-      <w:proofErr w:type="gramEnd"/>
-      <w:r>
-        <w:rPr>
-          <w:sz w:val="20"/>
-        </w:rPr>
-        <w:t>PEP) lists, to identify any records of convicted individuals based on commonly used identifiers.</w:t>
+        <w:t>(PEP) lists, to identify any records of convicted individuals based on commonly used identifiers.</w:t>
       </w:r>
     </w:p>
     <w:p>

</xml_diff>